<commit_message>
[US00] - atualização de documentos
</commit_message>
<xml_diff>
--- a/documentos/Documento funcional Cutover.docx
+++ b/documentos/Documento funcional Cutover.docx
@@ -83,7 +83,19 @@
         <w:rPr>
           <w:lang w:val="pt-BR"/>
         </w:rPr>
-        <w:t xml:space="preserve"> é necessario:</w:t>
+        <w:t xml:space="preserve"> é necess</w:t>
+      </w:r>
+      <w:r>
+        <w:rPr>
+          <w:lang w:val="pt-BR"/>
+        </w:rPr>
+        <w:t>á</w:t>
+      </w:r>
+      <w:r>
+        <w:rPr>
+          <w:lang w:val="pt-BR"/>
+        </w:rPr>
+        <w:t>rio:</w:t>
       </w:r>
     </w:p>
     <w:p>
@@ -369,6 +381,7 @@
         <w:rPr>
           <w:b/>
           <w:bCs/>
+          <w:noProof/>
           <w:lang w:val="pt-BR"/>
         </w:rPr>
         <w:drawing>
@@ -452,6 +465,7 @@
         <w:rPr>
           <w:b/>
           <w:bCs/>
+          <w:noProof/>
           <w:lang w:val="pt-BR"/>
         </w:rPr>
         <w:drawing>
@@ -507,15 +521,7 @@
           <w:bCs/>
           <w:lang w:val="pt-BR"/>
         </w:rPr>
-        <w:t xml:space="preserve">Imagem </w:t>
-      </w:r>
-      <w:r>
-        <w:rPr>
-          <w:b/>
-          <w:bCs/>
-          <w:lang w:val="pt-BR"/>
-        </w:rPr>
-        <w:t>3</w:t>
+        <w:t>Imagem 3</w:t>
       </w:r>
     </w:p>
     <w:p>
@@ -651,12 +657,10 @@
       </w:r>
     </w:p>
     <w:sectPr>
-      <w:headerReference w:type="even" r:id="rId12"/>
-      <w:headerReference w:type="default" r:id="rId13"/>
-      <w:footerReference w:type="even" r:id="rId14"/>
-      <w:footerReference w:type="default" r:id="rId15"/>
-      <w:headerReference w:type="first" r:id="rId16"/>
-      <w:footerReference w:type="first" r:id="rId17"/>
+      <w:headerReference w:type="default" r:id="rId12"/>
+      <w:footerReference w:type="default" r:id="rId13"/>
+      <w:headerReference w:type="first" r:id="rId14"/>
+      <w:footerReference w:type="first" r:id="rId15"/>
       <w:pgSz w:w="12242" w:h="15842" w:code="1"/>
       <w:pgMar w:top="2722" w:right="1276" w:bottom="936" w:left="1361" w:header="709" w:footer="2666" w:gutter="0"/>
       <w:cols w:space="708"/>
@@ -687,16 +691,6 @@
 </file>
 
 <file path=word/footer1.xml><?xml version="1.0" encoding="utf-8"?>
-<w:ftr xmlns:wpc="http://schemas.microsoft.com/office/word/2010/wordprocessingCanvas" xmlns:cx="http://schemas.microsoft.com/office/drawing/2014/chartex" xmlns:cx1="http://schemas.microsoft.com/office/drawing/2015/9/8/chartex" xmlns:cx2="http://schemas.microsoft.com/office/drawing/2015/10/21/chartex" xmlns:cx3="http://schemas.microsoft.com/office/drawing/2016/5/9/chartex" xmlns:cx4="http://schemas.microsoft.com/office/drawing/2016/5/10/chartex" xmlns:cx5="http://schemas.microsoft.com/office/drawing/2016/5/11/chartex" xmlns:cx6="http://schemas.microsoft.com/office/drawing/2016/5/12/chartex" xmlns:cx7="http://schemas.microsoft.com/office/drawing/2016/5/13/chartex" xmlns:cx8="http://schemas.microsoft.com/office/drawing/2016/5/14/chartex" xmlns:mc="http://schemas.openxmlformats.org/markup-compatibility/2006" xmlns:aink="http://schemas.microsoft.com/office/drawing/2016/ink" xmlns:am3d="http://schemas.microsoft.com/office/drawing/2017/model3d" xmlns:o="urn:schemas-microsoft-com:office:office" xmlns:oel="http://schemas.microsoft.com/office/2019/extlst" xmlns:r="http://schemas.openxmlformats.org/officeDocument/2006/relationships" xmlns:m="http://schemas.openxmlformats.org/officeDocument/2006/math" xmlns:v="urn:schemas-microsoft-com:vml" xmlns:wp14="http://schemas.microsoft.com/office/word/2010/wordprocessingDrawing" xmlns:wp="http://schemas.openxmlformats.org/drawingml/2006/wordprocessingDrawing" xmlns:w10="urn:schemas-microsoft-com:office:word" xmlns:w="http://schemas.openxmlformats.org/wordprocessingml/2006/main" xmlns:w14="http://schemas.microsoft.com/office/word/2010/wordml" xmlns:w15="http://schemas.microsoft.com/office/word/2012/wordml" xmlns:w16cex="http://schemas.microsoft.com/office/word/2018/wordml/cex" xmlns:w16cid="http://schemas.microsoft.com/office/word/2016/wordml/cid" xmlns:w16="http://schemas.microsoft.com/office/word/2018/wordml" xmlns:w16du="http://schemas.microsoft.com/office/word/2023/wordml/word16du" xmlns:w16sdtdh="http://schemas.microsoft.com/office/word/2020/wordml/sdtdatahash" xmlns:w16sdtfl="http://schemas.microsoft.com/office/word/2024/wordml/sdtformatlock" xmlns:w16se="http://schemas.microsoft.com/office/word/2015/wordml/symex" xmlns:wpg="http://schemas.microsoft.com/office/word/2010/wordprocessingGroup" xmlns:wpi="http://schemas.microsoft.com/office/word/2010/wordprocessingInk" xmlns:wne="http://schemas.microsoft.com/office/word/2006/wordml" xmlns:wps="http://schemas.microsoft.com/office/word/2010/wordprocessingShape" mc:Ignorable="w14 w15 w16se w16cid w16 w16cex w16sdtdh w16sdtfl w16du wp14">
-  <w:p>
-    <w:pPr>
-      <w:pStyle w:val="Footer"/>
-    </w:pPr>
-  </w:p>
-</w:ftr>
-</file>
-
-<file path=word/footer2.xml><?xml version="1.0" encoding="utf-8"?>
 <w:ftr xmlns:wpc="http://schemas.microsoft.com/office/word/2010/wordprocessingCanvas" xmlns:cx="http://schemas.microsoft.com/office/drawing/2014/chartex" xmlns:cx1="http://schemas.microsoft.com/office/drawing/2015/9/8/chartex" xmlns:cx2="http://schemas.microsoft.com/office/drawing/2015/10/21/chartex" xmlns:cx3="http://schemas.microsoft.com/office/drawing/2016/5/9/chartex" xmlns:cx4="http://schemas.microsoft.com/office/drawing/2016/5/10/chartex" xmlns:cx5="http://schemas.microsoft.com/office/drawing/2016/5/11/chartex" xmlns:cx6="http://schemas.microsoft.com/office/drawing/2016/5/12/chartex" xmlns:cx7="http://schemas.microsoft.com/office/drawing/2016/5/13/chartex" xmlns:cx8="http://schemas.microsoft.com/office/drawing/2016/5/14/chartex" xmlns:mc="http://schemas.openxmlformats.org/markup-compatibility/2006" xmlns:aink="http://schemas.microsoft.com/office/drawing/2016/ink" xmlns:am3d="http://schemas.microsoft.com/office/drawing/2017/model3d" xmlns:o="urn:schemas-microsoft-com:office:office" xmlns:oel="http://schemas.microsoft.com/office/2019/extlst" xmlns:r="http://schemas.openxmlformats.org/officeDocument/2006/relationships" xmlns:m="http://schemas.openxmlformats.org/officeDocument/2006/math" xmlns:v="urn:schemas-microsoft-com:vml" xmlns:wp14="http://schemas.microsoft.com/office/word/2010/wordprocessingDrawing" xmlns:wp="http://schemas.openxmlformats.org/drawingml/2006/wordprocessingDrawing" xmlns:w10="urn:schemas-microsoft-com:office:word" xmlns:w="http://schemas.openxmlformats.org/wordprocessingml/2006/main" xmlns:w14="http://schemas.microsoft.com/office/word/2010/wordml" xmlns:w15="http://schemas.microsoft.com/office/word/2012/wordml" xmlns:w16cex="http://schemas.microsoft.com/office/word/2018/wordml/cex" xmlns:w16cid="http://schemas.microsoft.com/office/word/2016/wordml/cid" xmlns:w16="http://schemas.microsoft.com/office/word/2018/wordml" xmlns:w16du="http://schemas.microsoft.com/office/word/2023/wordml/word16du" xmlns:w16sdtdh="http://schemas.microsoft.com/office/word/2020/wordml/sdtdatahash" xmlns:w16sdtfl="http://schemas.microsoft.com/office/word/2024/wordml/sdtformatlock" xmlns:w16se="http://schemas.microsoft.com/office/word/2015/wordml/symex" xmlns:wpg="http://schemas.microsoft.com/office/word/2010/wordprocessingGroup" xmlns:wpi="http://schemas.microsoft.com/office/word/2010/wordprocessingInk" xmlns:wne="http://schemas.microsoft.com/office/word/2006/wordml" xmlns:wps="http://schemas.microsoft.com/office/word/2010/wordprocessingShape" mc:Ignorable="w14 w15 w16se w16cid w16 w16cex w16sdtdh w16sdtfl w16du wp14">
   <w:p>
     <w:pPr>
@@ -832,67 +826,6 @@
       </mc:AlternateContent>
     </w:r>
     <w:r>
-      <w:rPr>
-        <w:noProof/>
-        <w:lang w:val="en-IN" w:eastAsia="en-IN"/>
-      </w:rPr>
-      <w:drawing>
-        <wp:anchor distT="0" distB="0" distL="114300" distR="114300" simplePos="0" relativeHeight="251694080" behindDoc="0" locked="0" layoutInCell="1" allowOverlap="1" wp14:anchorId="3B289F22" wp14:editId="206DBB69">
-          <wp:simplePos x="0" y="0"/>
-          <wp:positionH relativeFrom="column">
-            <wp:posOffset>5706110</wp:posOffset>
-          </wp:positionH>
-          <wp:positionV relativeFrom="paragraph">
-            <wp:posOffset>482551</wp:posOffset>
-          </wp:positionV>
-          <wp:extent cx="937260" cy="1151890"/>
-          <wp:effectExtent l="0" t="0" r="0" b="0"/>
-          <wp:wrapNone/>
-          <wp:docPr id="5" name="Picture 7"/>
-          <wp:cNvGraphicFramePr>
-            <a:graphicFrameLocks xmlns:a="http://schemas.openxmlformats.org/drawingml/2006/main" noChangeAspect="1"/>
-          </wp:cNvGraphicFramePr>
-          <a:graphic xmlns:a="http://schemas.openxmlformats.org/drawingml/2006/main">
-            <a:graphicData uri="http://schemas.openxmlformats.org/drawingml/2006/picture">
-              <pic:pic xmlns:pic="http://schemas.openxmlformats.org/drawingml/2006/picture">
-                <pic:nvPicPr>
-                  <pic:cNvPr id="0" name="selo_maior_2.0cm.jpg"/>
-                  <pic:cNvPicPr/>
-                </pic:nvPicPr>
-                <pic:blipFill>
-                  <a:blip r:embed="rId1" cstate="print">
-                    <a:extLst>
-                      <a:ext uri="{28A0092B-C50C-407E-A947-70E740481C1C}">
-                        <a14:useLocalDpi xmlns:a14="http://schemas.microsoft.com/office/drawing/2010/main" val="0"/>
-                      </a:ext>
-                    </a:extLst>
-                  </a:blip>
-                  <a:stretch>
-                    <a:fillRect/>
-                  </a:stretch>
-                </pic:blipFill>
-                <pic:spPr>
-                  <a:xfrm>
-                    <a:off x="0" y="0"/>
-                    <a:ext cx="937260" cy="1151890"/>
-                  </a:xfrm>
-                  <a:prstGeom prst="rect">
-                    <a:avLst/>
-                  </a:prstGeom>
-                </pic:spPr>
-              </pic:pic>
-            </a:graphicData>
-          </a:graphic>
-          <wp14:sizeRelH relativeFrom="margin">
-            <wp14:pctWidth>0</wp14:pctWidth>
-          </wp14:sizeRelH>
-          <wp14:sizeRelV relativeFrom="margin">
-            <wp14:pctHeight>0</wp14:pctHeight>
-          </wp14:sizeRelV>
-        </wp:anchor>
-      </w:drawing>
-    </w:r>
-    <w:r>
       <w:tab/>
     </w:r>
     <w:r>
@@ -1010,7 +943,7 @@
 </w:ftr>
 </file>
 
-<file path=word/footer3.xml><?xml version="1.0" encoding="utf-8"?>
+<file path=word/footer2.xml><?xml version="1.0" encoding="utf-8"?>
 <w:ftr xmlns:wpc="http://schemas.microsoft.com/office/word/2010/wordprocessingCanvas" xmlns:cx="http://schemas.microsoft.com/office/drawing/2014/chartex" xmlns:cx1="http://schemas.microsoft.com/office/drawing/2015/9/8/chartex" xmlns:cx2="http://schemas.microsoft.com/office/drawing/2015/10/21/chartex" xmlns:cx3="http://schemas.microsoft.com/office/drawing/2016/5/9/chartex" xmlns:cx4="http://schemas.microsoft.com/office/drawing/2016/5/10/chartex" xmlns:cx5="http://schemas.microsoft.com/office/drawing/2016/5/11/chartex" xmlns:cx6="http://schemas.microsoft.com/office/drawing/2016/5/12/chartex" xmlns:cx7="http://schemas.microsoft.com/office/drawing/2016/5/13/chartex" xmlns:cx8="http://schemas.microsoft.com/office/drawing/2016/5/14/chartex" xmlns:mc="http://schemas.openxmlformats.org/markup-compatibility/2006" xmlns:aink="http://schemas.microsoft.com/office/drawing/2016/ink" xmlns:am3d="http://schemas.microsoft.com/office/drawing/2017/model3d" xmlns:o="urn:schemas-microsoft-com:office:office" xmlns:oel="http://schemas.microsoft.com/office/2019/extlst" xmlns:r="http://schemas.openxmlformats.org/officeDocument/2006/relationships" xmlns:m="http://schemas.openxmlformats.org/officeDocument/2006/math" xmlns:v="urn:schemas-microsoft-com:vml" xmlns:wp14="http://schemas.microsoft.com/office/word/2010/wordprocessingDrawing" xmlns:wp="http://schemas.openxmlformats.org/drawingml/2006/wordprocessingDrawing" xmlns:w10="urn:schemas-microsoft-com:office:word" xmlns:w="http://schemas.openxmlformats.org/wordprocessingml/2006/main" xmlns:w14="http://schemas.microsoft.com/office/word/2010/wordml" xmlns:w15="http://schemas.microsoft.com/office/word/2012/wordml" xmlns:w16cex="http://schemas.microsoft.com/office/word/2018/wordml/cex" xmlns:w16cid="http://schemas.microsoft.com/office/word/2016/wordml/cid" xmlns:w16="http://schemas.microsoft.com/office/word/2018/wordml" xmlns:w16du="http://schemas.microsoft.com/office/word/2023/wordml/word16du" xmlns:w16sdtdh="http://schemas.microsoft.com/office/word/2020/wordml/sdtdatahash" xmlns:w16sdtfl="http://schemas.microsoft.com/office/word/2024/wordml/sdtformatlock" xmlns:w16se="http://schemas.microsoft.com/office/word/2015/wordml/symex" xmlns:wpg="http://schemas.microsoft.com/office/word/2010/wordprocessingGroup" xmlns:wpi="http://schemas.microsoft.com/office/word/2010/wordprocessingInk" xmlns:wne="http://schemas.microsoft.com/office/word/2006/wordml" xmlns:wps="http://schemas.microsoft.com/office/word/2010/wordprocessingShape" mc:Ignorable="w14 w15 w16se w16cid w16 w16cex w16sdtdh w16sdtfl w16du wp14">
   <w:p>
     <w:pPr>
@@ -1146,67 +1079,6 @@
       </mc:AlternateContent>
     </w:r>
     <w:r>
-      <w:rPr>
-        <w:noProof/>
-        <w:lang w:val="en-IN" w:eastAsia="en-IN"/>
-      </w:rPr>
-      <w:drawing>
-        <wp:anchor distT="0" distB="0" distL="114300" distR="114300" simplePos="0" relativeHeight="251679744" behindDoc="0" locked="0" layoutInCell="1" allowOverlap="1" wp14:anchorId="37129176" wp14:editId="5E63310F">
-          <wp:simplePos x="0" y="0"/>
-          <wp:positionH relativeFrom="column">
-            <wp:posOffset>5706110</wp:posOffset>
-          </wp:positionH>
-          <wp:positionV relativeFrom="paragraph">
-            <wp:posOffset>482551</wp:posOffset>
-          </wp:positionV>
-          <wp:extent cx="937260" cy="1151890"/>
-          <wp:effectExtent l="0" t="0" r="0" b="0"/>
-          <wp:wrapNone/>
-          <wp:docPr id="1" name="Picture 7"/>
-          <wp:cNvGraphicFramePr>
-            <a:graphicFrameLocks xmlns:a="http://schemas.openxmlformats.org/drawingml/2006/main" noChangeAspect="1"/>
-          </wp:cNvGraphicFramePr>
-          <a:graphic xmlns:a="http://schemas.openxmlformats.org/drawingml/2006/main">
-            <a:graphicData uri="http://schemas.openxmlformats.org/drawingml/2006/picture">
-              <pic:pic xmlns:pic="http://schemas.openxmlformats.org/drawingml/2006/picture">
-                <pic:nvPicPr>
-                  <pic:cNvPr id="0" name="selo_maior_2.0cm.jpg"/>
-                  <pic:cNvPicPr/>
-                </pic:nvPicPr>
-                <pic:blipFill>
-                  <a:blip r:embed="rId1" cstate="print">
-                    <a:extLst>
-                      <a:ext uri="{28A0092B-C50C-407E-A947-70E740481C1C}">
-                        <a14:useLocalDpi xmlns:a14="http://schemas.microsoft.com/office/drawing/2010/main" val="0"/>
-                      </a:ext>
-                    </a:extLst>
-                  </a:blip>
-                  <a:stretch>
-                    <a:fillRect/>
-                  </a:stretch>
-                </pic:blipFill>
-                <pic:spPr>
-                  <a:xfrm>
-                    <a:off x="0" y="0"/>
-                    <a:ext cx="937260" cy="1151890"/>
-                  </a:xfrm>
-                  <a:prstGeom prst="rect">
-                    <a:avLst/>
-                  </a:prstGeom>
-                </pic:spPr>
-              </pic:pic>
-            </a:graphicData>
-          </a:graphic>
-          <wp14:sizeRelH relativeFrom="margin">
-            <wp14:pctWidth>0</wp14:pctWidth>
-          </wp14:sizeRelH>
-          <wp14:sizeRelV relativeFrom="margin">
-            <wp14:pctHeight>0</wp14:pctHeight>
-          </wp14:sizeRelV>
-        </wp:anchor>
-      </w:drawing>
-    </w:r>
-    <w:r>
       <w:tab/>
     </w:r>
     <w:r>
@@ -1241,16 +1113,246 @@
     <w:pPr>
       <w:pStyle w:val="Header"/>
     </w:pPr>
-  </w:p>
-</w:hdr>
-</file>
-
-<file path=word/header2.xml><?xml version="1.0" encoding="utf-8"?>
-<w:hdr xmlns:wpc="http://schemas.microsoft.com/office/word/2010/wordprocessingCanvas" xmlns:cx="http://schemas.microsoft.com/office/drawing/2014/chartex" xmlns:cx1="http://schemas.microsoft.com/office/drawing/2015/9/8/chartex" xmlns:cx2="http://schemas.microsoft.com/office/drawing/2015/10/21/chartex" xmlns:cx3="http://schemas.microsoft.com/office/drawing/2016/5/9/chartex" xmlns:cx4="http://schemas.microsoft.com/office/drawing/2016/5/10/chartex" xmlns:cx5="http://schemas.microsoft.com/office/drawing/2016/5/11/chartex" xmlns:cx6="http://schemas.microsoft.com/office/drawing/2016/5/12/chartex" xmlns:cx7="http://schemas.microsoft.com/office/drawing/2016/5/13/chartex" xmlns:cx8="http://schemas.microsoft.com/office/drawing/2016/5/14/chartex" xmlns:mc="http://schemas.openxmlformats.org/markup-compatibility/2006" xmlns:aink="http://schemas.microsoft.com/office/drawing/2016/ink" xmlns:am3d="http://schemas.microsoft.com/office/drawing/2017/model3d" xmlns:o="urn:schemas-microsoft-com:office:office" xmlns:oel="http://schemas.microsoft.com/office/2019/extlst" xmlns:r="http://schemas.openxmlformats.org/officeDocument/2006/relationships" xmlns:m="http://schemas.openxmlformats.org/officeDocument/2006/math" xmlns:v="urn:schemas-microsoft-com:vml" xmlns:wp14="http://schemas.microsoft.com/office/word/2010/wordprocessingDrawing" xmlns:wp="http://schemas.openxmlformats.org/drawingml/2006/wordprocessingDrawing" xmlns:w10="urn:schemas-microsoft-com:office:word" xmlns:w="http://schemas.openxmlformats.org/wordprocessingml/2006/main" xmlns:w14="http://schemas.microsoft.com/office/word/2010/wordml" xmlns:w15="http://schemas.microsoft.com/office/word/2012/wordml" xmlns:w16cex="http://schemas.microsoft.com/office/word/2018/wordml/cex" xmlns:w16cid="http://schemas.microsoft.com/office/word/2016/wordml/cid" xmlns:w16="http://schemas.microsoft.com/office/word/2018/wordml" xmlns:w16du="http://schemas.microsoft.com/office/word/2023/wordml/word16du" xmlns:w16sdtdh="http://schemas.microsoft.com/office/word/2020/wordml/sdtdatahash" xmlns:w16sdtfl="http://schemas.microsoft.com/office/word/2024/wordml/sdtformatlock" xmlns:w16se="http://schemas.microsoft.com/office/word/2015/wordml/symex" xmlns:wpg="http://schemas.microsoft.com/office/word/2010/wordprocessingGroup" xmlns:wpi="http://schemas.microsoft.com/office/word/2010/wordprocessingInk" xmlns:wne="http://schemas.microsoft.com/office/word/2006/wordml" xmlns:wps="http://schemas.microsoft.com/office/word/2010/wordprocessingShape" mc:Ignorable="w14 w15 w16se w16cid w16 w16cex w16sdtdh w16sdtfl w16du wp14">
-  <w:p>
-    <w:pPr>
-      <w:pStyle w:val="Header"/>
-    </w:pPr>
+    <w:r>
+      <w:rPr>
+        <w:noProof/>
+        <w:lang w:val="en-GB" w:eastAsia="en-GB"/>
+      </w:rPr>
+      <mc:AlternateContent>
+        <mc:Choice Requires="wps">
+          <w:drawing>
+            <wp:anchor distT="0" distB="0" distL="114300" distR="114300" simplePos="0" relativeHeight="251697152" behindDoc="0" locked="1" layoutInCell="1" allowOverlap="1" wp14:anchorId="08743D2A" wp14:editId="1F779068">
+              <wp:simplePos x="0" y="0"/>
+              <wp:positionH relativeFrom="column">
+                <wp:posOffset>4102100</wp:posOffset>
+              </wp:positionH>
+              <wp:positionV relativeFrom="paragraph">
+                <wp:posOffset>3175</wp:posOffset>
+              </wp:positionV>
+              <wp:extent cx="1887220" cy="285750"/>
+              <wp:effectExtent l="0" t="0" r="0" b="0"/>
+              <wp:wrapTight wrapText="bothSides">
+                <wp:wrapPolygon edited="0">
+                  <wp:start x="436" y="0"/>
+                  <wp:lineTo x="436" y="20160"/>
+                  <wp:lineTo x="20931" y="20160"/>
+                  <wp:lineTo x="20931" y="0"/>
+                  <wp:lineTo x="436" y="0"/>
+                </wp:wrapPolygon>
+              </wp:wrapTight>
+              <wp:docPr id="1284232309" name="Text Box 30"/>
+              <wp:cNvGraphicFramePr>
+                <a:graphicFrameLocks xmlns:a="http://schemas.openxmlformats.org/drawingml/2006/main"/>
+              </wp:cNvGraphicFramePr>
+              <a:graphic xmlns:a="http://schemas.openxmlformats.org/drawingml/2006/main">
+                <a:graphicData uri="http://schemas.microsoft.com/office/word/2010/wordprocessingShape">
+                  <wps:wsp>
+                    <wps:cNvSpPr txBox="1">
+                      <a:spLocks noChangeArrowheads="1"/>
+                    </wps:cNvSpPr>
+                    <wps:spPr bwMode="auto">
+                      <a:xfrm>
+                        <a:off x="0" y="0"/>
+                        <a:ext cx="1887220" cy="285750"/>
+                      </a:xfrm>
+                      <a:prstGeom prst="rect">
+                        <a:avLst/>
+                      </a:prstGeom>
+                      <a:noFill/>
+                      <a:ln>
+                        <a:noFill/>
+                      </a:ln>
+                      <a:extLst>
+                        <a:ext uri="{909E8E84-426E-40DD-AFC4-6F175D3DCCD1}">
+                          <a14:hiddenFill xmlns:a14="http://schemas.microsoft.com/office/drawing/2010/main">
+                            <a:solidFill>
+                              <a:srgbClr val="FFFFFF"/>
+                            </a:solidFill>
+                          </a14:hiddenFill>
+                        </a:ext>
+                        <a:ext uri="{91240B29-F687-4F45-9708-019B960494DF}">
+                          <a14:hiddenLine xmlns:a14="http://schemas.microsoft.com/office/drawing/2010/main" w="9525">
+                            <a:solidFill>
+                              <a:srgbClr val="000000"/>
+                            </a:solidFill>
+                            <a:miter lim="800000"/>
+                            <a:headEnd/>
+                            <a:tailEnd/>
+                          </a14:hiddenLine>
+                        </a:ext>
+                      </a:extLst>
+                    </wps:spPr>
+                    <wps:txbx>
+                      <w:txbxContent>
+                        <w:p>
+                          <w:pPr>
+                            <w:pStyle w:val="EYContinuationheader"/>
+                          </w:pPr>
+                          <w:r>
+                            <w:t>POC EY</w:t>
+                          </w:r>
+                        </w:p>
+                      </w:txbxContent>
+                    </wps:txbx>
+                    <wps:bodyPr rot="0" vert="horz" wrap="square" lIns="91440" tIns="45720" rIns="91440" bIns="45720" anchor="t" anchorCtr="0" upright="1">
+                      <a:noAutofit/>
+                    </wps:bodyPr>
+                  </wps:wsp>
+                </a:graphicData>
+              </a:graphic>
+              <wp14:sizeRelH relativeFrom="page">
+                <wp14:pctWidth>0</wp14:pctWidth>
+              </wp14:sizeRelH>
+              <wp14:sizeRelV relativeFrom="page">
+                <wp14:pctHeight>0</wp14:pctHeight>
+              </wp14:sizeRelV>
+            </wp:anchor>
+          </w:drawing>
+        </mc:Choice>
+        <mc:Fallback>
+          <w:pict>
+            <v:shapetype w14:anchorId="08743D2A" id="_x0000_t202" coordsize="21600,21600" o:spt="202" path="m,l,21600r21600,l21600,xe">
+              <v:stroke joinstyle="miter"/>
+              <v:path gradientshapeok="t" o:connecttype="rect"/>
+            </v:shapetype>
+            <v:shape id="Text Box 30" o:spid="_x0000_s1026" type="#_x0000_t202" style="position:absolute;margin-left:323pt;margin-top:.25pt;width:148.6pt;height:22.5pt;z-index:251697152;visibility:visible;mso-wrap-style:square;mso-width-percent:0;mso-height-percent:0;mso-wrap-distance-left:9pt;mso-wrap-distance-top:0;mso-wrap-distance-right:9pt;mso-wrap-distance-bottom:0;mso-position-horizontal:absolute;mso-position-horizontal-relative:text;mso-position-vertical:absolute;mso-position-vertical-relative:text;mso-width-percent:0;mso-height-percent:0;mso-width-relative:page;mso-height-relative:page;v-text-anchor:top" o:gfxdata="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" filled="f" stroked="f">
+              <v:textbox>
+                <w:txbxContent>
+                  <w:p>
+                    <w:pPr>
+                      <w:pStyle w:val="EYContinuationheader"/>
+                    </w:pPr>
+                    <w:r>
+                      <w:t>POC EY</w:t>
+                    </w:r>
+                  </w:p>
+                </w:txbxContent>
+              </v:textbox>
+              <w10:wrap type="tight"/>
+              <w10:anchorlock/>
+            </v:shape>
+          </w:pict>
+        </mc:Fallback>
+      </mc:AlternateContent>
+    </w:r>
+    <w:r>
+      <w:rPr>
+        <w:noProof/>
+        <w:lang w:val="en-GB" w:eastAsia="en-GB"/>
+      </w:rPr>
+      <mc:AlternateContent>
+        <mc:Choice Requires="wps">
+          <w:drawing>
+            <wp:anchor distT="0" distB="0" distL="114300" distR="114300" simplePos="0" relativeHeight="251698176" behindDoc="0" locked="1" layoutInCell="1" allowOverlap="1" wp14:anchorId="3C1B516F" wp14:editId="48EBA0B6">
+              <wp:simplePos x="0" y="0"/>
+              <wp:positionH relativeFrom="column">
+                <wp:posOffset>4000500</wp:posOffset>
+              </wp:positionH>
+              <wp:positionV relativeFrom="paragraph">
+                <wp:posOffset>177165</wp:posOffset>
+              </wp:positionV>
+              <wp:extent cx="1988820" cy="244475"/>
+              <wp:effectExtent l="0" t="0" r="0" b="0"/>
+              <wp:wrapTight wrapText="bothSides">
+                <wp:wrapPolygon edited="0">
+                  <wp:start x="414" y="0"/>
+                  <wp:lineTo x="414" y="20197"/>
+                  <wp:lineTo x="20897" y="20197"/>
+                  <wp:lineTo x="20897" y="0"/>
+                  <wp:lineTo x="414" y="0"/>
+                </wp:wrapPolygon>
+              </wp:wrapTight>
+              <wp:docPr id="1145217746" name="Text Box 31"/>
+              <wp:cNvGraphicFramePr>
+                <a:graphicFrameLocks xmlns:a="http://schemas.openxmlformats.org/drawingml/2006/main"/>
+              </wp:cNvGraphicFramePr>
+              <a:graphic xmlns:a="http://schemas.openxmlformats.org/drawingml/2006/main">
+                <a:graphicData uri="http://schemas.microsoft.com/office/word/2010/wordprocessingShape">
+                  <wps:wsp>
+                    <wps:cNvSpPr txBox="1">
+                      <a:spLocks noChangeArrowheads="1"/>
+                    </wps:cNvSpPr>
+                    <wps:spPr bwMode="auto">
+                      <a:xfrm>
+                        <a:off x="0" y="0"/>
+                        <a:ext cx="1988820" cy="244475"/>
+                      </a:xfrm>
+                      <a:prstGeom prst="rect">
+                        <a:avLst/>
+                      </a:prstGeom>
+                      <a:noFill/>
+                      <a:ln>
+                        <a:noFill/>
+                      </a:ln>
+                      <a:extLst>
+                        <a:ext uri="{909E8E84-426E-40DD-AFC4-6F175D3DCCD1}">
+                          <a14:hiddenFill xmlns:a14="http://schemas.microsoft.com/office/drawing/2010/main">
+                            <a:solidFill>
+                              <a:srgbClr val="FFFFFF"/>
+                            </a:solidFill>
+                          </a14:hiddenFill>
+                        </a:ext>
+                        <a:ext uri="{91240B29-F687-4F45-9708-019B960494DF}">
+                          <a14:hiddenLine xmlns:a14="http://schemas.microsoft.com/office/drawing/2010/main" w="9525">
+                            <a:solidFill>
+                              <a:srgbClr val="000000"/>
+                            </a:solidFill>
+                            <a:miter lim="800000"/>
+                            <a:headEnd/>
+                            <a:tailEnd/>
+                          </a14:hiddenLine>
+                        </a:ext>
+                      </a:extLst>
+                    </wps:spPr>
+                    <wps:txbx>
+                      <w:txbxContent>
+                        <w:p>
+                          <w:pPr>
+                            <w:pStyle w:val="EYContinuationheader"/>
+                          </w:pPr>
+                          <w:r>
+                            <w:t>POC EY Enterprise</w:t>
+                          </w:r>
+                        </w:p>
+                      </w:txbxContent>
+                    </wps:txbx>
+                    <wps:bodyPr rot="0" vert="horz" wrap="square" lIns="91440" tIns="45720" rIns="91440" bIns="45720" anchor="t" anchorCtr="0" upright="1">
+                      <a:noAutofit/>
+                    </wps:bodyPr>
+                  </wps:wsp>
+                </a:graphicData>
+              </a:graphic>
+              <wp14:sizeRelH relativeFrom="page">
+                <wp14:pctWidth>0</wp14:pctWidth>
+              </wp14:sizeRelH>
+              <wp14:sizeRelV relativeFrom="page">
+                <wp14:pctHeight>0</wp14:pctHeight>
+              </wp14:sizeRelV>
+            </wp:anchor>
+          </w:drawing>
+        </mc:Choice>
+        <mc:Fallback>
+          <w:pict>
+            <v:shape w14:anchorId="3C1B516F" id="Text Box 31" o:spid="_x0000_s1027" type="#_x0000_t202" style="position:absolute;margin-left:315pt;margin-top:13.95pt;width:156.6pt;height:19.25pt;z-index:251698176;visibility:visible;mso-wrap-style:square;mso-width-percent:0;mso-height-percent:0;mso-wrap-distance-left:9pt;mso-wrap-distance-top:0;mso-wrap-distance-right:9pt;mso-wrap-distance-bottom:0;mso-position-horizontal:absolute;mso-position-horizontal-relative:text;mso-position-vertical:absolute;mso-position-vertical-relative:text;mso-width-percent:0;mso-height-percent:0;mso-width-relative:page;mso-height-relative:page;v-text-anchor:top" o:gfxdata="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" filled="f" stroked="f">
+              <v:textbox>
+                <w:txbxContent>
+                  <w:p>
+                    <w:pPr>
+                      <w:pStyle w:val="EYContinuationheader"/>
+                    </w:pPr>
+                    <w:r>
+                      <w:t>POC EY Enterprise</w:t>
+                    </w:r>
+                  </w:p>
+                </w:txbxContent>
+              </v:textbox>
+              <w10:wrap type="tight"/>
+              <w10:anchorlock/>
+            </v:shape>
+          </w:pict>
+        </mc:Fallback>
+      </mc:AlternateContent>
+    </w:r>
     <w:r>
       <w:rPr>
         <w:noProof/>
@@ -1335,140 +1437,7 @@
       <mc:AlternateContent>
         <mc:Choice Requires="wps">
           <w:drawing>
-            <wp:anchor distT="0" distB="0" distL="114300" distR="114300" simplePos="0" relativeHeight="251663360" behindDoc="0" locked="1" layoutInCell="1" allowOverlap="1" wp14:anchorId="29A0F910" wp14:editId="20C9EA47">
-              <wp:simplePos x="0" y="0"/>
-              <wp:positionH relativeFrom="column">
-                <wp:posOffset>4100195</wp:posOffset>
-              </wp:positionH>
-              <wp:positionV relativeFrom="paragraph">
-                <wp:posOffset>210820</wp:posOffset>
-              </wp:positionV>
-              <wp:extent cx="1883410" cy="244475"/>
-              <wp:effectExtent l="4445" t="1270" r="0" b="1905"/>
-              <wp:wrapTight wrapText="bothSides">
-                <wp:wrapPolygon edited="0">
-                  <wp:start x="0" y="0"/>
-                  <wp:lineTo x="21600" y="0"/>
-                  <wp:lineTo x="21600" y="21600"/>
-                  <wp:lineTo x="0" y="21600"/>
-                  <wp:lineTo x="0" y="0"/>
-                </wp:wrapPolygon>
-              </wp:wrapTight>
-              <wp:docPr id="630248950" name="Text Box 35"/>
-              <wp:cNvGraphicFramePr>
-                <a:graphicFrameLocks xmlns:a="http://schemas.openxmlformats.org/drawingml/2006/main"/>
-              </wp:cNvGraphicFramePr>
-              <a:graphic xmlns:a="http://schemas.openxmlformats.org/drawingml/2006/main">
-                <a:graphicData uri="http://schemas.microsoft.com/office/word/2010/wordprocessingShape">
-                  <wps:wsp>
-                    <wps:cNvSpPr txBox="1">
-                      <a:spLocks noChangeArrowheads="1"/>
-                    </wps:cNvSpPr>
-                    <wps:spPr bwMode="auto">
-                      <a:xfrm>
-                        <a:off x="0" y="0"/>
-                        <a:ext cx="1883410" cy="244475"/>
-                      </a:xfrm>
-                      <a:prstGeom prst="rect">
-                        <a:avLst/>
-                      </a:prstGeom>
-                      <a:noFill/>
-                      <a:ln>
-                        <a:noFill/>
-                      </a:ln>
-                      <a:extLst>
-                        <a:ext uri="{909E8E84-426E-40DD-AFC4-6F175D3DCCD1}">
-                          <a14:hiddenFill xmlns:a14="http://schemas.microsoft.com/office/drawing/2010/main">
-                            <a:solidFill>
-                              <a:srgbClr val="FFFFFF"/>
-                            </a:solidFill>
-                          </a14:hiddenFill>
-                        </a:ext>
-                        <a:ext uri="{91240B29-F687-4F45-9708-019B960494DF}">
-                          <a14:hiddenLine xmlns:a14="http://schemas.microsoft.com/office/drawing/2010/main" w="9525">
-                            <a:solidFill>
-                              <a:srgbClr val="000000"/>
-                            </a:solidFill>
-                            <a:miter lim="800000"/>
-                            <a:headEnd/>
-                            <a:tailEnd/>
-                          </a14:hiddenLine>
-                        </a:ext>
-                      </a:extLst>
-                    </wps:spPr>
-                    <wps:txbx>
-                      <w:txbxContent>
-                        <w:p>
-                          <w:pPr>
-                            <w:pStyle w:val="EYContinuationheader"/>
-                          </w:pPr>
-                          <w:r>
-                            <w:fldChar w:fldCharType="begin"/>
-                          </w:r>
-                          <w:r>
-                            <w:instrText xml:space="preserve"> MACROBUTTON  NoMacro [Insert Company Name]</w:instrText>
-                          </w:r>
-                          <w:r>
-                            <w:fldChar w:fldCharType="end"/>
-                          </w:r>
-                        </w:p>
-                      </w:txbxContent>
-                    </wps:txbx>
-                    <wps:bodyPr rot="0" vert="horz" wrap="square" lIns="91440" tIns="45720" rIns="91440" bIns="45720" anchor="t" anchorCtr="0" upright="1">
-                      <a:noAutofit/>
-                    </wps:bodyPr>
-                  </wps:wsp>
-                </a:graphicData>
-              </a:graphic>
-              <wp14:sizeRelH relativeFrom="page">
-                <wp14:pctWidth>0</wp14:pctWidth>
-              </wp14:sizeRelH>
-              <wp14:sizeRelV relativeFrom="page">
-                <wp14:pctHeight>0</wp14:pctHeight>
-              </wp14:sizeRelV>
-            </wp:anchor>
-          </w:drawing>
-        </mc:Choice>
-        <mc:Fallback>
-          <w:pict>
-            <v:shapetype w14:anchorId="29A0F910" id="_x0000_t202" coordsize="21600,21600" o:spt="202" path="m,l,21600r21600,l21600,xe">
-              <v:stroke joinstyle="miter"/>
-              <v:path gradientshapeok="t" o:connecttype="rect"/>
-            </v:shapetype>
-            <v:shape id="Text Box 35" o:spid="_x0000_s1026" type="#_x0000_t202" style="position:absolute;margin-left:322.85pt;margin-top:16.6pt;width:148.3pt;height:19.25pt;z-index:251663360;visibility:visible;mso-wrap-style:square;mso-width-percent:0;mso-height-percent:0;mso-wrap-distance-left:9pt;mso-wrap-distance-top:0;mso-wrap-distance-right:9pt;mso-wrap-distance-bottom:0;mso-position-horizontal:absolute;mso-position-horizontal-relative:text;mso-position-vertical:absolute;mso-position-vertical-relative:text;mso-width-percent:0;mso-height-percent:0;mso-width-relative:page;mso-height-relative:page;v-text-anchor:top" o:gfxdata="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" filled="f" stroked="f">
-              <v:textbox>
-                <w:txbxContent>
-                  <w:p>
-                    <w:pPr>
-                      <w:pStyle w:val="EYContinuationheader"/>
-                    </w:pPr>
-                    <w:r>
-                      <w:fldChar w:fldCharType="begin"/>
-                    </w:r>
-                    <w:r>
-                      <w:instrText xml:space="preserve"> MACROBUTTON  NoMacro [Insert Company Name]</w:instrText>
-                    </w:r>
-                    <w:r>
-                      <w:fldChar w:fldCharType="end"/>
-                    </w:r>
-                  </w:p>
-                </w:txbxContent>
-              </v:textbox>
-              <w10:wrap type="tight"/>
-              <w10:anchorlock/>
-            </v:shape>
-          </w:pict>
-        </mc:Fallback>
-      </mc:AlternateContent>
-    </w:r>
-    <w:r>
-      <w:rPr>
-        <w:noProof/>
-      </w:rPr>
-      <mc:AlternateContent>
-        <mc:Choice Requires="wps">
-          <w:drawing>
-            <wp:anchor distT="0" distB="0" distL="114300" distR="114300" simplePos="0" relativeHeight="251661312" behindDoc="0" locked="1" layoutInCell="1" allowOverlap="1" wp14:anchorId="1F7FAEE2" wp14:editId="754AB81B">
+            <wp:anchor distT="0" distB="0" distL="114300" distR="114300" simplePos="0" relativeHeight="251661312" behindDoc="0" locked="1" layoutInCell="1" allowOverlap="1" wp14:anchorId="1F7FAEE2" wp14:editId="6829DBBC">
               <wp:simplePos x="0" y="0"/>
               <wp:positionH relativeFrom="page">
                 <wp:posOffset>4633595</wp:posOffset>
@@ -1574,7 +1543,7 @@
         </mc:Choice>
         <mc:Fallback>
           <w:pict>
-            <v:shape w14:anchorId="1F7FAEE2" id="Text Box 33" o:spid="_x0000_s1027" type="#_x0000_t202" style="position:absolute;margin-left:364.85pt;margin-top:68.3pt;width:166.7pt;height:17.95pt;z-index:251661312;visibility:visible;mso-wrap-style:square;mso-width-percent:0;mso-height-percent:0;mso-wrap-distance-left:9pt;mso-wrap-distance-top:0;mso-wrap-distance-right:9pt;mso-wrap-distance-bottom:0;mso-position-horizontal:absolute;mso-position-horizontal-relative:page;mso-position-vertical:absolute;mso-position-vertical-relative:page;mso-width-percent:0;mso-height-percent:0;mso-width-relative:page;mso-height-relative:page;v-text-anchor:top" o:gfxdata="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" filled="f" stroked="f">
+            <v:shape w14:anchorId="1F7FAEE2" id="Text Box 33" o:spid="_x0000_s1028" type="#_x0000_t202" style="position:absolute;margin-left:364.85pt;margin-top:68.3pt;width:166.7pt;height:17.95pt;z-index:251661312;visibility:visible;mso-wrap-style:square;mso-width-percent:0;mso-height-percent:0;mso-wrap-distance-left:9pt;mso-wrap-distance-top:0;mso-wrap-distance-right:9pt;mso-wrap-distance-bottom:0;mso-position-horizontal:absolute;mso-position-horizontal-relative:page;mso-position-vertical:absolute;mso-position-vertical-relative:page;mso-width-percent:0;mso-height-percent:0;mso-width-relative:page;mso-height-relative:page;v-text-anchor:top" o:gfxdata="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" filled="f" stroked="f">
               <v:textbox inset="0,0,0,0">
                 <w:txbxContent>
                   <w:p>
@@ -1621,139 +1590,10 @@
     <w:r>
       <w:rPr>
         <w:noProof/>
-      </w:rPr>
-      <mc:AlternateContent>
-        <mc:Choice Requires="wps">
-          <w:drawing>
-            <wp:anchor distT="0" distB="0" distL="114300" distR="114300" simplePos="0" relativeHeight="251662336" behindDoc="0" locked="1" layoutInCell="1" allowOverlap="1" wp14:anchorId="0064E64D" wp14:editId="147F91C9">
-              <wp:simplePos x="0" y="0"/>
-              <wp:positionH relativeFrom="column">
-                <wp:posOffset>4100195</wp:posOffset>
-              </wp:positionH>
-              <wp:positionV relativeFrom="paragraph">
-                <wp:posOffset>36830</wp:posOffset>
-              </wp:positionV>
-              <wp:extent cx="1883410" cy="285750"/>
-              <wp:effectExtent l="4445" t="0" r="0" b="1270"/>
-              <wp:wrapTight wrapText="bothSides">
-                <wp:wrapPolygon edited="0">
-                  <wp:start x="0" y="0"/>
-                  <wp:lineTo x="21600" y="0"/>
-                  <wp:lineTo x="21600" y="21600"/>
-                  <wp:lineTo x="0" y="21600"/>
-                  <wp:lineTo x="0" y="0"/>
-                </wp:wrapPolygon>
-              </wp:wrapTight>
-              <wp:docPr id="816490506" name="Text Box 34"/>
-              <wp:cNvGraphicFramePr>
-                <a:graphicFrameLocks xmlns:a="http://schemas.openxmlformats.org/drawingml/2006/main"/>
-              </wp:cNvGraphicFramePr>
-              <a:graphic xmlns:a="http://schemas.openxmlformats.org/drawingml/2006/main">
-                <a:graphicData uri="http://schemas.microsoft.com/office/word/2010/wordprocessingShape">
-                  <wps:wsp>
-                    <wps:cNvSpPr txBox="1">
-                      <a:spLocks noChangeArrowheads="1"/>
-                    </wps:cNvSpPr>
-                    <wps:spPr bwMode="auto">
-                      <a:xfrm>
-                        <a:off x="0" y="0"/>
-                        <a:ext cx="1883410" cy="285750"/>
-                      </a:xfrm>
-                      <a:prstGeom prst="rect">
-                        <a:avLst/>
-                      </a:prstGeom>
-                      <a:noFill/>
-                      <a:ln>
-                        <a:noFill/>
-                      </a:ln>
-                      <a:extLst>
-                        <a:ext uri="{909E8E84-426E-40DD-AFC4-6F175D3DCCD1}">
-                          <a14:hiddenFill xmlns:a14="http://schemas.microsoft.com/office/drawing/2010/main">
-                            <a:solidFill>
-                              <a:srgbClr val="FFFFFF"/>
-                            </a:solidFill>
-                          </a14:hiddenFill>
-                        </a:ext>
-                        <a:ext uri="{91240B29-F687-4F45-9708-019B960494DF}">
-                          <a14:hiddenLine xmlns:a14="http://schemas.microsoft.com/office/drawing/2010/main" w="9525">
-                            <a:solidFill>
-                              <a:srgbClr val="000000"/>
-                            </a:solidFill>
-                            <a:miter lim="800000"/>
-                            <a:headEnd/>
-                            <a:tailEnd/>
-                          </a14:hiddenLine>
-                        </a:ext>
-                      </a:extLst>
-                    </wps:spPr>
-                    <wps:txbx>
-                      <w:txbxContent>
-                        <w:p>
-                          <w:pPr>
-                            <w:pStyle w:val="EYContinuationheader"/>
-                          </w:pPr>
-                          <w:r>
-                            <w:fldChar w:fldCharType="begin"/>
-                          </w:r>
-                          <w:r>
-                            <w:instrText xml:space="preserve"> MACROBUTTON  NoMacro [Insert Name]</w:instrText>
-                          </w:r>
-                          <w:r>
-                            <w:fldChar w:fldCharType="end"/>
-                          </w:r>
-                        </w:p>
-                      </w:txbxContent>
-                    </wps:txbx>
-                    <wps:bodyPr rot="0" vert="horz" wrap="square" lIns="91440" tIns="45720" rIns="91440" bIns="45720" anchor="t" anchorCtr="0" upright="1">
-                      <a:noAutofit/>
-                    </wps:bodyPr>
-                  </wps:wsp>
-                </a:graphicData>
-              </a:graphic>
-              <wp14:sizeRelH relativeFrom="page">
-                <wp14:pctWidth>0</wp14:pctWidth>
-              </wp14:sizeRelH>
-              <wp14:sizeRelV relativeFrom="page">
-                <wp14:pctHeight>0</wp14:pctHeight>
-              </wp14:sizeRelV>
-            </wp:anchor>
-          </w:drawing>
-        </mc:Choice>
-        <mc:Fallback>
-          <w:pict>
-            <v:shape w14:anchorId="0064E64D" id="Text Box 34" o:spid="_x0000_s1028" type="#_x0000_t202" style="position:absolute;margin-left:322.85pt;margin-top:2.9pt;width:148.3pt;height:22.5pt;z-index:251662336;visibility:visible;mso-wrap-style:square;mso-width-percent:0;mso-height-percent:0;mso-wrap-distance-left:9pt;mso-wrap-distance-top:0;mso-wrap-distance-right:9pt;mso-wrap-distance-bottom:0;mso-position-horizontal:absolute;mso-position-horizontal-relative:text;mso-position-vertical:absolute;mso-position-vertical-relative:text;mso-width-percent:0;mso-height-percent:0;mso-width-relative:page;mso-height-relative:page;v-text-anchor:top" o:gfxdata="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" filled="f" stroked="f">
-              <v:textbox>
-                <w:txbxContent>
-                  <w:p>
-                    <w:pPr>
-                      <w:pStyle w:val="EYContinuationheader"/>
-                    </w:pPr>
-                    <w:r>
-                      <w:fldChar w:fldCharType="begin"/>
-                    </w:r>
-                    <w:r>
-                      <w:instrText xml:space="preserve"> MACROBUTTON  NoMacro [Insert Name]</w:instrText>
-                    </w:r>
-                    <w:r>
-                      <w:fldChar w:fldCharType="end"/>
-                    </w:r>
-                  </w:p>
-                </w:txbxContent>
-              </v:textbox>
-              <w10:wrap type="tight"/>
-              <w10:anchorlock/>
-            </v:shape>
-          </w:pict>
-        </mc:Fallback>
-      </mc:AlternateContent>
-    </w:r>
-    <w:r>
-      <w:rPr>
-        <w:noProof/>
         <w:lang w:val="en-IN" w:eastAsia="en-IN"/>
       </w:rPr>
       <w:drawing>
-        <wp:anchor distT="0" distB="0" distL="114300" distR="114300" simplePos="0" relativeHeight="251692032" behindDoc="0" locked="1" layoutInCell="1" allowOverlap="1" wp14:anchorId="39E3D56A" wp14:editId="747F1B3F">
+        <wp:anchor distT="0" distB="0" distL="114300" distR="114300" simplePos="0" relativeHeight="251692032" behindDoc="0" locked="1" layoutInCell="1" allowOverlap="1" wp14:anchorId="39E3D56A" wp14:editId="28DFAB9E">
           <wp:simplePos x="0" y="0"/>
           <wp:positionH relativeFrom="page">
             <wp:posOffset>998220</wp:posOffset>
@@ -1819,7 +1659,7 @@
 </w:hdr>
 </file>
 
-<file path=word/header3.xml><?xml version="1.0" encoding="utf-8"?>
+<file path=word/header2.xml><?xml version="1.0" encoding="utf-8"?>
 <w:hdr xmlns:wpc="http://schemas.microsoft.com/office/word/2010/wordprocessingCanvas" xmlns:cx="http://schemas.microsoft.com/office/drawing/2014/chartex" xmlns:cx1="http://schemas.microsoft.com/office/drawing/2015/9/8/chartex" xmlns:cx2="http://schemas.microsoft.com/office/drawing/2015/10/21/chartex" xmlns:cx3="http://schemas.microsoft.com/office/drawing/2016/5/9/chartex" xmlns:cx4="http://schemas.microsoft.com/office/drawing/2016/5/10/chartex" xmlns:cx5="http://schemas.microsoft.com/office/drawing/2016/5/11/chartex" xmlns:cx6="http://schemas.microsoft.com/office/drawing/2016/5/12/chartex" xmlns:cx7="http://schemas.microsoft.com/office/drawing/2016/5/13/chartex" xmlns:cx8="http://schemas.microsoft.com/office/drawing/2016/5/14/chartex" xmlns:mc="http://schemas.openxmlformats.org/markup-compatibility/2006" xmlns:aink="http://schemas.microsoft.com/office/drawing/2016/ink" xmlns:am3d="http://schemas.microsoft.com/office/drawing/2017/model3d" xmlns:o="urn:schemas-microsoft-com:office:office" xmlns:oel="http://schemas.microsoft.com/office/2019/extlst" xmlns:r="http://schemas.openxmlformats.org/officeDocument/2006/relationships" xmlns:m="http://schemas.openxmlformats.org/officeDocument/2006/math" xmlns:v="urn:schemas-microsoft-com:vml" xmlns:wp14="http://schemas.microsoft.com/office/word/2010/wordprocessingDrawing" xmlns:wp="http://schemas.openxmlformats.org/drawingml/2006/wordprocessingDrawing" xmlns:w10="urn:schemas-microsoft-com:office:word" xmlns:w="http://schemas.openxmlformats.org/wordprocessingml/2006/main" xmlns:w14="http://schemas.microsoft.com/office/word/2010/wordml" xmlns:w15="http://schemas.microsoft.com/office/word/2012/wordml" xmlns:w16cex="http://schemas.microsoft.com/office/word/2018/wordml/cex" xmlns:w16cid="http://schemas.microsoft.com/office/word/2016/wordml/cid" xmlns:w16="http://schemas.microsoft.com/office/word/2018/wordml" xmlns:w16du="http://schemas.microsoft.com/office/word/2023/wordml/word16du" xmlns:w16sdtdh="http://schemas.microsoft.com/office/word/2020/wordml/sdtdatahash" xmlns:w16sdtfl="http://schemas.microsoft.com/office/word/2024/wordml/sdtformatlock" xmlns:w16se="http://schemas.microsoft.com/office/word/2015/wordml/symex" xmlns:wpg="http://schemas.microsoft.com/office/word/2010/wordprocessingGroup" xmlns:wpi="http://schemas.microsoft.com/office/word/2010/wordprocessingInk" xmlns:wne="http://schemas.microsoft.com/office/word/2006/wordml" xmlns:wps="http://schemas.microsoft.com/office/word/2010/wordprocessingShape" mc:Ignorable="w14 w15 w16se w16cid w16 w16cex w16sdtdh w16sdtfl w16du wp14">
   <w:p>
     <w:pPr>
@@ -2120,7 +1960,13 @@
                             <w:pStyle w:val="EYContinuationheader"/>
                           </w:pPr>
                           <w:r>
-                            <w:t>POEY Enterprise</w:t>
+                            <w:t>PO</w:t>
+                          </w:r>
+                          <w:r>
+                            <w:t xml:space="preserve">C </w:t>
+                          </w:r>
+                          <w:r>
+                            <w:t>EY Enterprise</w:t>
                           </w:r>
                         </w:p>
                       </w:txbxContent>
@@ -2142,7 +1988,11 @@
         </mc:Choice>
         <mc:Fallback>
           <w:pict>
-            <v:shape w14:anchorId="0572609B" id="Text Box 31" o:spid="_x0000_s1032" type="#_x0000_t202" style="position:absolute;margin-left:342.5pt;margin-top:16.05pt;width:156.6pt;height:19.25pt;z-index:251688960;visibility:visible;mso-wrap-style:square;mso-width-percent:0;mso-height-percent:0;mso-wrap-distance-left:9pt;mso-wrap-distance-top:0;mso-wrap-distance-right:9pt;mso-wrap-distance-bottom:0;mso-position-horizontal:absolute;mso-position-horizontal-relative:text;mso-position-vertical:absolute;mso-position-vertical-relative:text;mso-width-percent:0;mso-height-percent:0;mso-width-relative:page;mso-height-relative:page;v-text-anchor:top" o:gfxdata="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" filled="f" stroked="f">
+            <v:shapetype w14:anchorId="0572609B" id="_x0000_t202" coordsize="21600,21600" o:spt="202" path="m,l,21600r21600,l21600,xe">
+              <v:stroke joinstyle="miter"/>
+              <v:path gradientshapeok="t" o:connecttype="rect"/>
+            </v:shapetype>
+            <v:shape id="_x0000_s1032" type="#_x0000_t202" style="position:absolute;margin-left:342.5pt;margin-top:16.05pt;width:156.6pt;height:19.25pt;z-index:251688960;visibility:visible;mso-wrap-style:square;mso-width-percent:0;mso-height-percent:0;mso-wrap-distance-left:9pt;mso-wrap-distance-top:0;mso-wrap-distance-right:9pt;mso-wrap-distance-bottom:0;mso-position-horizontal:absolute;mso-position-horizontal-relative:text;mso-position-vertical:absolute;mso-position-vertical-relative:text;mso-width-percent:0;mso-height-percent:0;mso-width-relative:page;mso-height-relative:page;v-text-anchor:top" o:gfxdata="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" filled="f" stroked="f">
               <v:textbox>
                 <w:txbxContent>
                   <w:p>
@@ -2150,7 +2000,13 @@
                       <w:pStyle w:val="EYContinuationheader"/>
                     </w:pPr>
                     <w:r>
-                      <w:t>POEY Enterprise</w:t>
+                      <w:t>PO</w:t>
+                    </w:r>
+                    <w:r>
+                      <w:t xml:space="preserve">C </w:t>
+                    </w:r>
+                    <w:r>
+                      <w:t>EY Enterprise</w:t>
                     </w:r>
                   </w:p>
                 </w:txbxContent>
@@ -2170,7 +2026,7 @@
       <mc:AlternateContent>
         <mc:Choice Requires="wps">
           <w:drawing>
-            <wp:anchor distT="0" distB="0" distL="114300" distR="114300" simplePos="0" relativeHeight="251687936" behindDoc="0" locked="1" layoutInCell="1" allowOverlap="1" wp14:anchorId="0FF0D6DB" wp14:editId="30D7A163">
+            <wp:anchor distT="0" distB="0" distL="114300" distR="114300" simplePos="0" relativeHeight="251687936" behindDoc="0" locked="1" layoutInCell="1" allowOverlap="1" wp14:anchorId="0FF0D6DB" wp14:editId="6EDE6FCF">
               <wp:simplePos x="0" y="0"/>
               <wp:positionH relativeFrom="column">
                 <wp:posOffset>4451350</wp:posOffset>
@@ -2260,7 +2116,7 @@
         </mc:Choice>
         <mc:Fallback>
           <w:pict>
-            <v:shape w14:anchorId="0FF0D6DB" id="Text Box 30" o:spid="_x0000_s1033" type="#_x0000_t202" style="position:absolute;margin-left:350.5pt;margin-top:2.35pt;width:148.6pt;height:22.5pt;z-index:251687936;visibility:visible;mso-wrap-style:square;mso-width-percent:0;mso-height-percent:0;mso-wrap-distance-left:9pt;mso-wrap-distance-top:0;mso-wrap-distance-right:9pt;mso-wrap-distance-bottom:0;mso-position-horizontal:absolute;mso-position-horizontal-relative:text;mso-position-vertical:absolute;mso-position-vertical-relative:text;mso-width-percent:0;mso-height-percent:0;mso-width-relative:page;mso-height-relative:page;v-text-anchor:top" o:gfxdata="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" filled="f" stroked="f">
+            <v:shape w14:anchorId="0FF0D6DB" id="_x0000_s1033" type="#_x0000_t202" style="position:absolute;margin-left:350.5pt;margin-top:2.35pt;width:148.6pt;height:22.5pt;z-index:251687936;visibility:visible;mso-wrap-style:square;mso-width-percent:0;mso-height-percent:0;mso-wrap-distance-left:9pt;mso-wrap-distance-top:0;mso-wrap-distance-right:9pt;mso-wrap-distance-bottom:0;mso-position-horizontal:absolute;mso-position-horizontal-relative:text;mso-position-vertical:absolute;mso-position-vertical-relative:text;mso-width-percent:0;mso-height-percent:0;mso-width-relative:page;mso-height-relative:page;v-text-anchor:top" o:gfxdata="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" filled="f" stroked="f">
               <v:textbox>
                 <w:txbxContent>
                   <w:p>
@@ -3858,6 +3714,7 @@
   <w:style w:type="character" w:default="1" w:styleId="DefaultParagraphFont">
     <w:name w:val="Default Paragraph Font"/>
     <w:uiPriority w:val="1"/>
+    <w:semiHidden/>
     <w:unhideWhenUsed/>
   </w:style>
   <w:style w:type="table" w:default="1" w:styleId="TableNormal">

</xml_diff>